<commit_message>
Update Appium documentation, add inspector session, ignore Word ~WRL tmp files
- Update Dokumentacja projektowa.docx with latest changes
- Add inspectorCapabilitySet/ - Appium Inspector session for first app launch
- Add komenda przed korzystaniem projektu.txt - reminder to run 'nvm use'
- Remove package.json/package-lock.json (no longer needed in this folder)
- Ignore ~WRL*.tmp - another Word temp file pattern (besides ~$*)

Co-Authored-By: Claude Sonnet 4.6 <noreply@anthropic.com>
</commit_message>
<xml_diff>
--- a/Appium/Dokumentacja projektowa.docx
+++ b/Appium/Dokumentacja projektowa.docx
@@ -145,6 +145,9 @@
     </w:p>
     <w:p>
       <w:r>
+        <w:rPr>
+          <w:noProof/>
+        </w:rPr>
         <w:lastRenderedPageBreak/>
         <w:drawing>
           <wp:inline distT="0" distB="0" distL="0" distR="0" wp14:anchorId="35B430F1" wp14:editId="5CC664C4">
@@ -365,10 +368,203 @@
       <w:r>
         <w:t>Instalujemy plugin inspector</w:t>
       </w:r>
+      <w:r>
+        <w:t xml:space="preserve"> – dzięki niemu pobieram różne elementy na stronie </w:t>
+      </w:r>
     </w:p>
     <w:p>
       <w:r>
         <w:t>appium plugin install inspector</w:t>
+      </w:r>
+    </w:p>
+    <w:p/>
+    <w:p>
+      <w:r>
+        <w:t>Uruchominie serwera z pluginem Inspector.</w:t>
+      </w:r>
+    </w:p>
+    <w:p>
+      <w:r>
+        <w:t>appium --use-plugins=inspector</w:t>
+      </w:r>
+    </w:p>
+    <w:p>
+      <w:r>
+        <w:t>Telefon.</w:t>
+      </w:r>
+    </w:p>
+    <w:p>
+      <w:r>
+        <w:t>Podłączenie telefonu w tryb debugowania.</w:t>
+      </w:r>
+      <w:r>
+        <w:br/>
+        <w:t>Zezwolenie na debugowanie w trybie USB</w:t>
+      </w:r>
+    </w:p>
+    <w:p>
+      <w:r>
+        <w:lastRenderedPageBreak/>
+        <w:t>Zezwolnie po podłacznie na usb na telefonie</w:t>
+      </w:r>
+    </w:p>
+    <w:p>
+      <w:r>
+        <w:t>Sprawdzenie w CMD czy jest podłączone urządzenie</w:t>
+      </w:r>
+    </w:p>
+    <w:p>
+      <w:r>
+        <w:t>adb devices</w:t>
+      </w:r>
+    </w:p>
+    <w:p>
+      <w:r>
+        <w:t xml:space="preserve">Uruchomienie aplikacji na telefonie </w:t>
+      </w:r>
+    </w:p>
+    <w:p>
+      <w:r>
+        <w:t xml:space="preserve">Sprawdzenie w CMD jaka aplikacja jest uruchomiona </w:t>
+      </w:r>
+    </w:p>
+    <w:p>
+      <w:r>
+        <w:t>adb shell dumpsys window | find "mFocusedApp"</w:t>
+      </w:r>
+    </w:p>
+    <w:p>
+      <w:r>
+        <w:t xml:space="preserve">Sprawdzenie jaka wersja Androida jest </w:t>
+      </w:r>
+    </w:p>
+    <w:p>
+      <w:r>
+        <w:t>adb shell getprop ro.build.version.release</w:t>
+      </w:r>
+    </w:p>
+    <w:p>
+      <w:r>
+        <w:t>Uruchomienie Serwera Appim z pluginem Inspector</w:t>
+      </w:r>
+    </w:p>
+    <w:p>
+      <w:r>
+        <w:t>appium --use-plugins=inspector</w:t>
+      </w:r>
+    </w:p>
+    <w:p>
+      <w:r>
+        <w:t xml:space="preserve">Wypełniamy przykładowe dane </w:t>
+      </w:r>
+    </w:p>
+    <w:p>
+      <w:r>
+        <w:t>http://192.168.56.1:4723/inspector</w:t>
+      </w:r>
+    </w:p>
+    <w:p/>
+    <w:p>
+      <w:r>
+        <w:drawing>
+          <wp:inline distT="0" distB="0" distL="0" distR="0" wp14:anchorId="5E1C579F" wp14:editId="7174D78A">
+            <wp:extent cx="5760720" cy="2762885"/>
+            <wp:effectExtent l="0" t="0" r="0" b="0"/>
+            <wp:docPr id="2042811417" name="Obraz 1"/>
+            <wp:cNvGraphicFramePr>
+              <a:graphicFrameLocks xmlns:a="http://schemas.openxmlformats.org/drawingml/2006/main" noChangeAspect="1"/>
+            </wp:cNvGraphicFramePr>
+            <a:graphic xmlns:a="http://schemas.openxmlformats.org/drawingml/2006/main">
+              <a:graphicData uri="http://schemas.openxmlformats.org/drawingml/2006/picture">
+                <pic:pic xmlns:pic="http://schemas.openxmlformats.org/drawingml/2006/picture">
+                  <pic:nvPicPr>
+                    <pic:cNvPr id="2042811417" name=""/>
+                    <pic:cNvPicPr/>
+                  </pic:nvPicPr>
+                  <pic:blipFill>
+                    <a:blip r:embed="rId7"/>
+                    <a:stretch>
+                      <a:fillRect/>
+                    </a:stretch>
+                  </pic:blipFill>
+                  <pic:spPr>
+                    <a:xfrm>
+                      <a:off x="0" y="0"/>
+                      <a:ext cx="5760720" cy="2762885"/>
+                    </a:xfrm>
+                    <a:prstGeom prst="rect">
+                      <a:avLst/>
+                    </a:prstGeom>
+                  </pic:spPr>
+                </pic:pic>
+              </a:graphicData>
+            </a:graphic>
+          </wp:inline>
+        </w:drawing>
+      </w:r>
+    </w:p>
+    <w:p>
+      <w:r>
+        <w:rPr>
+          <w:b/>
+          <w:bCs/>
+        </w:rPr>
+        <w:t>Appium Inspector — Opis parametrów (Capabilities)</w:t>
+      </w:r>
+    </w:p>
+    <w:p>
+      <w:r>
+        <w:t>Tabela opisuje parametry konfiguracyjne używane przy łączeniu Appium Inspector z urządzeniem Android.</w:t>
+      </w:r>
+    </w:p>
+    <w:p/>
+    <w:p>
+      <w:r>
+        <w:rPr>
+          <w:i/>
+          <w:iCs/>
+        </w:rPr>
+        <w:t>Uwaga: Appium musi być uruchomiony poleceniem 'appium --use-plugins=inspector' w CMD przed rozpoczęciem sesji.</w:t>
+      </w:r>
+    </w:p>
+    <w:p>
+      <w:r>
+        <w:lastRenderedPageBreak/>
+        <w:drawing>
+          <wp:inline distT="0" distB="0" distL="0" distR="0" wp14:anchorId="1495C37A" wp14:editId="6E0FD5CA">
+            <wp:extent cx="5760720" cy="4414520"/>
+            <wp:effectExtent l="0" t="0" r="0" b="5080"/>
+            <wp:docPr id="1475685181" name="Obraz 1"/>
+            <wp:cNvGraphicFramePr>
+              <a:graphicFrameLocks xmlns:a="http://schemas.openxmlformats.org/drawingml/2006/main" noChangeAspect="1"/>
+            </wp:cNvGraphicFramePr>
+            <a:graphic xmlns:a="http://schemas.openxmlformats.org/drawingml/2006/main">
+              <a:graphicData uri="http://schemas.openxmlformats.org/drawingml/2006/picture">
+                <pic:pic xmlns:pic="http://schemas.openxmlformats.org/drawingml/2006/picture">
+                  <pic:nvPicPr>
+                    <pic:cNvPr id="1475685181" name=""/>
+                    <pic:cNvPicPr/>
+                  </pic:nvPicPr>
+                  <pic:blipFill>
+                    <a:blip r:embed="rId8"/>
+                    <a:stretch>
+                      <a:fillRect/>
+                    </a:stretch>
+                  </pic:blipFill>
+                  <pic:spPr>
+                    <a:xfrm>
+                      <a:off x="0" y="0"/>
+                      <a:ext cx="5760720" cy="4414520"/>
+                    </a:xfrm>
+                    <a:prstGeom prst="rect">
+                      <a:avLst/>
+                    </a:prstGeom>
+                  </pic:spPr>
+                </pic:pic>
+              </a:graphicData>
+            </a:graphic>
+          </wp:inline>
+        </w:drawing>
       </w:r>
     </w:p>
     <w:sectPr>

</xml_diff>